<commit_message>
12practise unit_modules unit_test documents
</commit_message>
<xml_diff>
--- a/Практическая работа 12.docx
+++ b/Практическая работа 12.docx
@@ -1,6 +1,6 @@
 
 <file path=word/document.xml><?xml version="1.0" encoding="utf-8"?>
-<w:document xmlns:wpc="http://schemas.microsoft.com/office/word/2010/wordprocessingCanvas" xmlns:cx="http://schemas.microsoft.com/office/drawing/2014/chartex" xmlns:cx1="http://schemas.microsoft.com/office/drawing/2015/9/8/chartex" xmlns:cx2="http://schemas.microsoft.com/office/drawing/2015/10/21/chartex" xmlns:cx3="http://schemas.microsoft.com/office/drawing/2016/5/9/chartex" xmlns:cx4="http://schemas.microsoft.com/office/drawing/2016/5/10/chartex" xmlns:cx5="http://schemas.microsoft.com/office/drawing/2016/5/11/chartex" xmlns:cx6="http://schemas.microsoft.com/office/drawing/2016/5/12/chartex" xmlns:cx7="http://schemas.microsoft.com/office/drawing/2016/5/13/chartex" xmlns:cx8="http://schemas.microsoft.com/office/drawing/2016/5/14/chartex" xmlns:mc="http://schemas.openxmlformats.org/markup-compatibility/2006" xmlns:aink="http://schemas.microsoft.com/office/drawing/2016/ink" xmlns:am3d="http://schemas.microsoft.com/office/drawing/2017/model3d" xmlns:o="urn:schemas-microsoft-com:office:office" xmlns:r="http://schemas.openxmlformats.org/officeDocument/2006/relationships" xmlns:m="http://schemas.openxmlformats.org/officeDocument/2006/math" xmlns:v="urn:schemas-microsoft-com:vml" xmlns:wp14="http://schemas.microsoft.com/office/word/2010/wordprocessingDrawing" xmlns:wp="http://schemas.openxmlformats.org/drawingml/2006/wordprocessingDrawing" xmlns:w10="urn:schemas-microsoft-com:office:word" xmlns:w="http://schemas.openxmlformats.org/wordprocessingml/2006/main" xmlns:w14="http://schemas.microsoft.com/office/word/2010/wordml" xmlns:w15="http://schemas.microsoft.com/office/word/2012/wordml" xmlns:w16cid="http://schemas.microsoft.com/office/word/2016/wordml/cid" xmlns:w16se="http://schemas.microsoft.com/office/word/2015/wordml/symex" xmlns:wpg="http://schemas.microsoft.com/office/word/2010/wordprocessingGroup" xmlns:wpi="http://schemas.microsoft.com/office/word/2010/wordprocessingInk" xmlns:wne="http://schemas.microsoft.com/office/word/2006/wordml" xmlns:wps="http://schemas.microsoft.com/office/word/2010/wordprocessingShape" mc:Ignorable="w14 w15 w16se w16cid wp14">
+<w:document xmlns:wpc="http://schemas.microsoft.com/office/word/2010/wordprocessingCanvas" xmlns:cx="http://schemas.microsoft.com/office/drawing/2014/chartex" xmlns:cx1="http://schemas.microsoft.com/office/drawing/2015/9/8/chartex" xmlns:cx2="http://schemas.microsoft.com/office/drawing/2015/10/21/chartex" xmlns:cx3="http://schemas.microsoft.com/office/drawing/2016/5/9/chartex" xmlns:cx4="http://schemas.microsoft.com/office/drawing/2016/5/10/chartex" xmlns:cx5="http://schemas.microsoft.com/office/drawing/2016/5/11/chartex" xmlns:cx6="http://schemas.microsoft.com/office/drawing/2016/5/12/chartex" xmlns:cx7="http://schemas.microsoft.com/office/drawing/2016/5/13/chartex" xmlns:cx8="http://schemas.microsoft.com/office/drawing/2016/5/14/chartex" xmlns:mc="http://schemas.openxmlformats.org/markup-compatibility/2006" xmlns:aink="http://schemas.microsoft.com/office/drawing/2016/ink" xmlns:am3d="http://schemas.microsoft.com/office/drawing/2017/model3d" xmlns:o="urn:schemas-microsoft-com:office:office" xmlns:oel="http://schemas.microsoft.com/office/2019/extlst" xmlns:r="http://schemas.openxmlformats.org/officeDocument/2006/relationships" xmlns:m="http://schemas.openxmlformats.org/officeDocument/2006/math" xmlns:v="urn:schemas-microsoft-com:vml" xmlns:wp14="http://schemas.microsoft.com/office/word/2010/wordprocessingDrawing" xmlns:wp="http://schemas.openxmlformats.org/drawingml/2006/wordprocessingDrawing" xmlns:w10="urn:schemas-microsoft-com:office:word" xmlns:w="http://schemas.openxmlformats.org/wordprocessingml/2006/main" xmlns:w14="http://schemas.microsoft.com/office/word/2010/wordml" xmlns:w15="http://schemas.microsoft.com/office/word/2012/wordml" xmlns:w16cex="http://schemas.microsoft.com/office/word/2018/wordml/cex" xmlns:w16cid="http://schemas.microsoft.com/office/word/2016/wordml/cid" xmlns:w16="http://schemas.microsoft.com/office/word/2018/wordml" xmlns:w16du="http://schemas.microsoft.com/office/word/2023/wordml/word16du" xmlns:w16sdtdh="http://schemas.microsoft.com/office/word/2020/wordml/sdtdatahash" xmlns:w16sdtfl="http://schemas.microsoft.com/office/word/2024/wordml/sdtformatlock" xmlns:w16se="http://schemas.microsoft.com/office/word/2015/wordml/symex" xmlns:wpg="http://schemas.microsoft.com/office/word/2010/wordprocessingGroup" xmlns:wpi="http://schemas.microsoft.com/office/word/2010/wordprocessingInk" xmlns:wne="http://schemas.microsoft.com/office/word/2006/wordml" xmlns:wps="http://schemas.microsoft.com/office/word/2010/wordprocessingShape" mc:Ignorable="w14 w15 w16se w16cid w16 w16cex w16sdtdh w16sdtfl w16du wp14">
   <w:body>
     <w:p>
       <w:pPr>
@@ -272,6 +272,9 @@
         </w:rPr>
       </w:pPr>
       <w:r>
+        <w:rPr>
+          <w:noProof/>
+        </w:rPr>
         <w:drawing>
           <wp:inline distT="0" distB="0" distL="0" distR="0" wp14:anchorId="47DC0655" wp14:editId="415E948D">
             <wp:extent cx="5940425" cy="3963035"/>
@@ -790,7 +793,6 @@
           <w:szCs w:val="24"/>
         </w:rPr>
       </w:pPr>
-      <w:bookmarkStart w:id="0" w:name="_GoBack"/>
       <w:r>
         <w:rPr>
           <w:noProof/>
@@ -831,7 +833,6 @@
           </wp:inline>
         </w:drawing>
       </w:r>
-      <w:bookmarkEnd w:id="0"/>
     </w:p>
     <w:p>
       <w:pPr>
@@ -884,6 +885,2103 @@
         </w:drawing>
       </w:r>
     </w:p>
+    <w:p>
+      <w:pPr>
+        <w:rPr>
+          <w:rFonts w:ascii="Times New Roman" w:hAnsi="Times New Roman" w:cs="Times New Roman"/>
+          <w:sz w:val="24"/>
+          <w:szCs w:val="24"/>
+          <w:lang w:val="en-US"/>
+        </w:rPr>
+      </w:pPr>
+      <w:r>
+        <w:rPr>
+          <w:rFonts w:ascii="Times New Roman" w:hAnsi="Times New Roman" w:cs="Times New Roman"/>
+          <w:sz w:val="24"/>
+          <w:szCs w:val="24"/>
+        </w:rPr>
+        <w:br w:type="page"/>
+      </w:r>
+    </w:p>
+    <w:p>
+      <w:pPr>
+        <w:pStyle w:val="Heading1"/>
+      </w:pPr>
+      <w:r>
+        <w:lastRenderedPageBreak/>
+        <w:t>Таблицы</w:t>
+      </w:r>
+    </w:p>
+    <w:tbl>
+      <w:tblPr>
+        <w:tblStyle w:val="TableGrid"/>
+        <w:tblW w:w="4995" w:type="pct"/>
+        <w:tblLook w:val="04A0" w:firstRow="1" w:lastRow="0" w:firstColumn="1" w:lastColumn="0" w:noHBand="0" w:noVBand="1"/>
+      </w:tblPr>
+      <w:tblGrid>
+        <w:gridCol w:w="4041"/>
+        <w:gridCol w:w="5295"/>
+      </w:tblGrid>
+      <w:tr>
+        <w:tc>
+          <w:tcPr>
+            <w:tcW w:w="2164" w:type="pct"/>
+            <w:shd w:val="clear" w:color="auto" w:fill="BFBFBF" w:themeFill="background1" w:themeFillShade="BF"/>
+          </w:tcPr>
+          <w:p>
+            <w:r>
+              <w:t>Порядковый номер #</w:t>
+            </w:r>
+          </w:p>
+        </w:tc>
+        <w:tc>
+          <w:tcPr>
+            <w:tcW w:w="2836" w:type="pct"/>
+            <w:shd w:val="clear" w:color="auto" w:fill="BFBFBF" w:themeFill="background1" w:themeFillShade="BF"/>
+          </w:tcPr>
+          <w:p>
+            <w:r>
+              <w:t>1</w:t>
+            </w:r>
+          </w:p>
+        </w:tc>
+      </w:tr>
+      <w:tr>
+        <w:tc>
+          <w:tcPr>
+            <w:tcW w:w="2164" w:type="pct"/>
+          </w:tcPr>
+          <w:p>
+            <w:r>
+              <w:t>Название класса</w:t>
+            </w:r>
+          </w:p>
+        </w:tc>
+        <w:tc>
+          <w:tcPr>
+            <w:tcW w:w="2836" w:type="pct"/>
+          </w:tcPr>
+          <w:p>
+            <w:r>
+              <w:t>Cup – стакан (цилиндр)</w:t>
+            </w:r>
+          </w:p>
+        </w:tc>
+      </w:tr>
+      <w:tr>
+        <w:tc>
+          <w:tcPr>
+            <w:tcW w:w="2164" w:type="pct"/>
+          </w:tcPr>
+          <w:p>
+            <w:r>
+              <w:t>Название метода</w:t>
+            </w:r>
+          </w:p>
+        </w:tc>
+        <w:tc>
+          <w:tcPr>
+            <w:tcW w:w="2836" w:type="pct"/>
+          </w:tcPr>
+          <w:p>
+            <w:proofErr w:type="spellStart"/>
+            <w:r>
+              <w:t>Volume</w:t>
+            </w:r>
+            <w:proofErr w:type="spellEnd"/>
+            <w:r>
+              <w:t xml:space="preserve"> – вычисляет полный объем стакана</w:t>
+            </w:r>
+          </w:p>
+        </w:tc>
+      </w:tr>
+      <w:tr>
+        <w:tc>
+          <w:tcPr>
+            <w:tcW w:w="2164" w:type="pct"/>
+          </w:tcPr>
+          <w:p>
+            <w:r>
+              <w:t>Резюме тестирования</w:t>
+            </w:r>
+          </w:p>
+        </w:tc>
+        <w:tc>
+          <w:tcPr>
+            <w:tcW w:w="2836" w:type="pct"/>
+          </w:tcPr>
+          <w:p>
+            <w:r>
+              <w:t>Проверяется корректный расчет объема цилиндра по высоте и диаметру</w:t>
+            </w:r>
+          </w:p>
+        </w:tc>
+      </w:tr>
+      <w:tr>
+        <w:tc>
+          <w:tcPr>
+            <w:tcW w:w="2164" w:type="pct"/>
+          </w:tcPr>
+          <w:p>
+            <w:r>
+              <w:t>Вид теста</w:t>
+            </w:r>
+          </w:p>
+        </w:tc>
+        <w:tc>
+          <w:tcPr>
+            <w:tcW w:w="2836" w:type="pct"/>
+          </w:tcPr>
+          <w:p>
+            <w:r>
+              <w:t>Позитивный</w:t>
+            </w:r>
+          </w:p>
+        </w:tc>
+      </w:tr>
+      <w:tr>
+        <w:tc>
+          <w:tcPr>
+            <w:tcW w:w="2164" w:type="pct"/>
+          </w:tcPr>
+          <w:p>
+            <w:r>
+              <w:t>Тестовые данные</w:t>
+            </w:r>
+          </w:p>
+        </w:tc>
+        <w:tc>
+          <w:tcPr>
+            <w:tcW w:w="2836" w:type="pct"/>
+          </w:tcPr>
+          <w:p>
+            <w:proofErr w:type="spellStart"/>
+            <w:r>
+              <w:t>Height</w:t>
+            </w:r>
+            <w:proofErr w:type="spellEnd"/>
+            <w:r>
+              <w:t xml:space="preserve"> = 10, </w:t>
+            </w:r>
+            <w:proofErr w:type="spellStart"/>
+            <w:r>
+              <w:t>Diameter</w:t>
+            </w:r>
+            <w:proofErr w:type="spellEnd"/>
+            <w:r>
+              <w:t xml:space="preserve"> = 5</w:t>
+            </w:r>
+          </w:p>
+        </w:tc>
+      </w:tr>
+      <w:tr>
+        <w:tc>
+          <w:tcPr>
+            <w:tcW w:w="2164" w:type="pct"/>
+          </w:tcPr>
+          <w:p>
+            <w:r>
+              <w:t>Название тестового метода</w:t>
+            </w:r>
+          </w:p>
+        </w:tc>
+        <w:tc>
+          <w:tcPr>
+            <w:tcW w:w="2836" w:type="pct"/>
+          </w:tcPr>
+          <w:p>
+            <w:r>
+              <w:t>Task12Cup_VolumeTest</w:t>
+            </w:r>
+          </w:p>
+        </w:tc>
+      </w:tr>
+      <w:tr>
+        <w:tc>
+          <w:tcPr>
+            <w:tcW w:w="2164" w:type="pct"/>
+          </w:tcPr>
+          <w:p>
+            <w:r>
+              <w:t>Ожидаемый результат</w:t>
+            </w:r>
+          </w:p>
+        </w:tc>
+        <w:tc>
+          <w:tcPr>
+            <w:tcW w:w="2836" w:type="pct"/>
+          </w:tcPr>
+          <w:p>
+            <w:r>
+              <w:t>Тест пройден. Метод вернет значение ≈ 196.35 (π * 2.5^2 * 10)</w:t>
+            </w:r>
+          </w:p>
+        </w:tc>
+      </w:tr>
+      <w:tr>
+        <w:tc>
+          <w:tcPr>
+            <w:tcW w:w="2164" w:type="pct"/>
+          </w:tcPr>
+          <w:p>
+            <w:r>
+              <w:t>Полученный результат</w:t>
+            </w:r>
+          </w:p>
+        </w:tc>
+        <w:tc>
+          <w:tcPr>
+            <w:tcW w:w="2836" w:type="pct"/>
+          </w:tcPr>
+          <w:p>
+            <w:r>
+              <w:t>Тест пройден. Метод вернул ≈ 196.35</w:t>
+            </w:r>
+          </w:p>
+        </w:tc>
+      </w:tr>
+      <w:tr>
+        <w:tc>
+          <w:tcPr>
+            <w:tcW w:w="2164" w:type="pct"/>
+          </w:tcPr>
+          <w:p>
+            <w:r>
+              <w:t>Статус теста</w:t>
+            </w:r>
+          </w:p>
+        </w:tc>
+        <w:tc>
+          <w:tcPr>
+            <w:tcW w:w="2836" w:type="pct"/>
+          </w:tcPr>
+          <w:p>
+            <w:r>
+              <w:t>Прошёл</w:t>
+            </w:r>
+          </w:p>
+        </w:tc>
+      </w:tr>
+    </w:tbl>
+    <w:p/>
+    <w:tbl>
+      <w:tblPr>
+        <w:tblStyle w:val="TableGrid"/>
+        <w:tblW w:w="4995" w:type="pct"/>
+        <w:tblLook w:val="04A0" w:firstRow="1" w:lastRow="0" w:firstColumn="1" w:lastColumn="0" w:noHBand="0" w:noVBand="1"/>
+      </w:tblPr>
+      <w:tblGrid>
+        <w:gridCol w:w="4041"/>
+        <w:gridCol w:w="5295"/>
+      </w:tblGrid>
+      <w:tr>
+        <w:tc>
+          <w:tcPr>
+            <w:tcW w:w="2164" w:type="pct"/>
+            <w:shd w:val="clear" w:color="auto" w:fill="BFBFBF" w:themeFill="background1" w:themeFillShade="BF"/>
+          </w:tcPr>
+          <w:p>
+            <w:r>
+              <w:t>Порядковый номер #</w:t>
+            </w:r>
+          </w:p>
+        </w:tc>
+        <w:tc>
+          <w:tcPr>
+            <w:tcW w:w="2836" w:type="pct"/>
+            <w:shd w:val="clear" w:color="auto" w:fill="BFBFBF" w:themeFill="background1" w:themeFillShade="BF"/>
+          </w:tcPr>
+          <w:p>
+            <w:r>
+              <w:t>2</w:t>
+            </w:r>
+          </w:p>
+        </w:tc>
+      </w:tr>
+      <w:tr>
+        <w:tc>
+          <w:tcPr>
+            <w:tcW w:w="2164" w:type="pct"/>
+          </w:tcPr>
+          <w:p>
+            <w:r>
+              <w:t>Название класса</w:t>
+            </w:r>
+          </w:p>
+        </w:tc>
+        <w:tc>
+          <w:tcPr>
+            <w:tcW w:w="2836" w:type="pct"/>
+          </w:tcPr>
+          <w:p>
+            <w:r>
+              <w:t>Cup – стакан (цилиндр)</w:t>
+            </w:r>
+          </w:p>
+        </w:tc>
+      </w:tr>
+      <w:tr>
+        <w:tc>
+          <w:tcPr>
+            <w:tcW w:w="2164" w:type="pct"/>
+          </w:tcPr>
+          <w:p>
+            <w:r>
+              <w:t>Название метода</w:t>
+            </w:r>
+          </w:p>
+        </w:tc>
+        <w:tc>
+          <w:tcPr>
+            <w:tcW w:w="2836" w:type="pct"/>
+          </w:tcPr>
+          <w:p>
+            <w:proofErr w:type="spellStart"/>
+            <w:r>
+              <w:t>FillPercent</w:t>
+            </w:r>
+            <w:proofErr w:type="spellEnd"/>
+            <w:r>
+              <w:t xml:space="preserve"> – вычисляет процент заполнения</w:t>
+            </w:r>
+          </w:p>
+        </w:tc>
+      </w:tr>
+      <w:tr>
+        <w:tc>
+          <w:tcPr>
+            <w:tcW w:w="2164" w:type="pct"/>
+          </w:tcPr>
+          <w:p>
+            <w:r>
+              <w:t>Резюме тестирования</w:t>
+            </w:r>
+          </w:p>
+        </w:tc>
+        <w:tc>
+          <w:tcPr>
+            <w:tcW w:w="2836" w:type="pct"/>
+          </w:tcPr>
+          <w:p>
+            <w:r>
+              <w:t>Проверяется возврат 0% при высоте жидкости 0</w:t>
+            </w:r>
+          </w:p>
+        </w:tc>
+      </w:tr>
+      <w:tr>
+        <w:tc>
+          <w:tcPr>
+            <w:tcW w:w="2164" w:type="pct"/>
+          </w:tcPr>
+          <w:p>
+            <w:r>
+              <w:t>Вид теста</w:t>
+            </w:r>
+          </w:p>
+        </w:tc>
+        <w:tc>
+          <w:tcPr>
+            <w:tcW w:w="2836" w:type="pct"/>
+          </w:tcPr>
+          <w:p>
+            <w:r>
+              <w:t>Позитивный (граничное значение)</w:t>
+            </w:r>
+          </w:p>
+        </w:tc>
+      </w:tr>
+      <w:tr>
+        <w:tc>
+          <w:tcPr>
+            <w:tcW w:w="2164" w:type="pct"/>
+          </w:tcPr>
+          <w:p>
+            <w:pPr>
+              <w:rPr>
+                <w:lang w:val="en-US"/>
+              </w:rPr>
+            </w:pPr>
+            <w:r>
+              <w:t>Тестовые</w:t>
+            </w:r>
+            <w:r>
+              <w:rPr>
+                <w:lang w:val="en-US"/>
+              </w:rPr>
+              <w:t xml:space="preserve"> </w:t>
+            </w:r>
+            <w:r>
+              <w:t>данные</w:t>
+            </w:r>
+          </w:p>
+        </w:tc>
+        <w:tc>
+          <w:tcPr>
+            <w:tcW w:w="2836" w:type="pct"/>
+          </w:tcPr>
+          <w:p>
+            <w:pPr>
+              <w:rPr>
+                <w:lang w:val="en-US"/>
+              </w:rPr>
+            </w:pPr>
+            <w:r>
+              <w:rPr>
+                <w:lang w:val="en-US"/>
+              </w:rPr>
+              <w:t xml:space="preserve">Height = 10, Diameter = 5, </w:t>
+            </w:r>
+            <w:proofErr w:type="spellStart"/>
+            <w:r>
+              <w:rPr>
+                <w:lang w:val="en-US"/>
+              </w:rPr>
+              <w:t>fillHeight</w:t>
+            </w:r>
+            <w:proofErr w:type="spellEnd"/>
+            <w:r>
+              <w:rPr>
+                <w:lang w:val="en-US"/>
+              </w:rPr>
+              <w:t xml:space="preserve"> = 0</w:t>
+            </w:r>
+          </w:p>
+        </w:tc>
+      </w:tr>
+      <w:tr>
+        <w:tc>
+          <w:tcPr>
+            <w:tcW w:w="2164" w:type="pct"/>
+          </w:tcPr>
+          <w:p>
+            <w:pPr>
+              <w:rPr>
+                <w:lang w:val="en-US"/>
+              </w:rPr>
+            </w:pPr>
+            <w:r>
+              <w:t>Название</w:t>
+            </w:r>
+            <w:r>
+              <w:rPr>
+                <w:lang w:val="en-US"/>
+              </w:rPr>
+              <w:t xml:space="preserve"> </w:t>
+            </w:r>
+            <w:r>
+              <w:t>тестового</w:t>
+            </w:r>
+            <w:r>
+              <w:rPr>
+                <w:lang w:val="en-US"/>
+              </w:rPr>
+              <w:t xml:space="preserve"> </w:t>
+            </w:r>
+            <w:r>
+              <w:t>метода</w:t>
+            </w:r>
+          </w:p>
+        </w:tc>
+        <w:tc>
+          <w:tcPr>
+            <w:tcW w:w="2836" w:type="pct"/>
+          </w:tcPr>
+          <w:p>
+            <w:pPr>
+              <w:rPr>
+                <w:lang w:val="en-US"/>
+              </w:rPr>
+            </w:pPr>
+            <w:r>
+              <w:rPr>
+                <w:lang w:val="en-US"/>
+              </w:rPr>
+              <w:t>Task12Cup_FillPercent_EmptyCup_ReturnsZero</w:t>
+            </w:r>
+          </w:p>
+        </w:tc>
+      </w:tr>
+      <w:tr>
+        <w:tc>
+          <w:tcPr>
+            <w:tcW w:w="2164" w:type="pct"/>
+          </w:tcPr>
+          <w:p>
+            <w:r>
+              <w:t>Ожидаемый результат</w:t>
+            </w:r>
+          </w:p>
+        </w:tc>
+        <w:tc>
+          <w:tcPr>
+            <w:tcW w:w="2836" w:type="pct"/>
+          </w:tcPr>
+          <w:p>
+            <w:r>
+              <w:t>Тест пройден. Метод вернет 0</w:t>
+            </w:r>
+          </w:p>
+        </w:tc>
+      </w:tr>
+      <w:tr>
+        <w:tc>
+          <w:tcPr>
+            <w:tcW w:w="2164" w:type="pct"/>
+          </w:tcPr>
+          <w:p>
+            <w:r>
+              <w:t>Полученный результат</w:t>
+            </w:r>
+          </w:p>
+        </w:tc>
+        <w:tc>
+          <w:tcPr>
+            <w:tcW w:w="2836" w:type="pct"/>
+          </w:tcPr>
+          <w:p>
+            <w:r>
+              <w:t>Тест пройден. Метод вернул 0</w:t>
+            </w:r>
+          </w:p>
+        </w:tc>
+      </w:tr>
+      <w:tr>
+        <w:tc>
+          <w:tcPr>
+            <w:tcW w:w="2164" w:type="pct"/>
+          </w:tcPr>
+          <w:p>
+            <w:r>
+              <w:t>Статус теста</w:t>
+            </w:r>
+          </w:p>
+        </w:tc>
+        <w:tc>
+          <w:tcPr>
+            <w:tcW w:w="2836" w:type="pct"/>
+          </w:tcPr>
+          <w:p>
+            <w:r>
+              <w:t>Прошёл</w:t>
+            </w:r>
+          </w:p>
+        </w:tc>
+      </w:tr>
+    </w:tbl>
+    <w:p/>
+    <w:tbl>
+      <w:tblPr>
+        <w:tblStyle w:val="TableGrid"/>
+        <w:tblW w:w="4995" w:type="pct"/>
+        <w:tblLook w:val="04A0" w:firstRow="1" w:lastRow="0" w:firstColumn="1" w:lastColumn="0" w:noHBand="0" w:noVBand="1"/>
+      </w:tblPr>
+      <w:tblGrid>
+        <w:gridCol w:w="4041"/>
+        <w:gridCol w:w="5295"/>
+      </w:tblGrid>
+      <w:tr>
+        <w:tc>
+          <w:tcPr>
+            <w:tcW w:w="2164" w:type="pct"/>
+            <w:shd w:val="clear" w:color="auto" w:fill="BFBFBF" w:themeFill="background1" w:themeFillShade="BF"/>
+          </w:tcPr>
+          <w:p>
+            <w:r>
+              <w:t>Порядковый номер #</w:t>
+            </w:r>
+          </w:p>
+        </w:tc>
+        <w:tc>
+          <w:tcPr>
+            <w:tcW w:w="2836" w:type="pct"/>
+            <w:shd w:val="clear" w:color="auto" w:fill="BFBFBF" w:themeFill="background1" w:themeFillShade="BF"/>
+          </w:tcPr>
+          <w:p>
+            <w:r>
+              <w:t>3</w:t>
+            </w:r>
+          </w:p>
+        </w:tc>
+      </w:tr>
+      <w:tr>
+        <w:tc>
+          <w:tcPr>
+            <w:tcW w:w="2164" w:type="pct"/>
+          </w:tcPr>
+          <w:p>
+            <w:r>
+              <w:t>Название класса</w:t>
+            </w:r>
+          </w:p>
+        </w:tc>
+        <w:tc>
+          <w:tcPr>
+            <w:tcW w:w="2836" w:type="pct"/>
+          </w:tcPr>
+          <w:p>
+            <w:r>
+              <w:t>Cup – стакан (цилиндр)</w:t>
+            </w:r>
+          </w:p>
+        </w:tc>
+      </w:tr>
+      <w:tr>
+        <w:tc>
+          <w:tcPr>
+            <w:tcW w:w="2164" w:type="pct"/>
+          </w:tcPr>
+          <w:p>
+            <w:r>
+              <w:t>Название метода</w:t>
+            </w:r>
+          </w:p>
+        </w:tc>
+        <w:tc>
+          <w:tcPr>
+            <w:tcW w:w="2836" w:type="pct"/>
+          </w:tcPr>
+          <w:p>
+            <w:proofErr w:type="spellStart"/>
+            <w:r>
+              <w:t>FillPercent</w:t>
+            </w:r>
+            <w:proofErr w:type="spellEnd"/>
+            <w:r>
+              <w:t xml:space="preserve"> – вычисляет процент заполнения</w:t>
+            </w:r>
+          </w:p>
+        </w:tc>
+      </w:tr>
+      <w:tr>
+        <w:tc>
+          <w:tcPr>
+            <w:tcW w:w="2164" w:type="pct"/>
+          </w:tcPr>
+          <w:p>
+            <w:r>
+              <w:t>Резюме тестирования</w:t>
+            </w:r>
+          </w:p>
+        </w:tc>
+        <w:tc>
+          <w:tcPr>
+            <w:tcW w:w="2836" w:type="pct"/>
+          </w:tcPr>
+          <w:p>
+            <w:r>
+              <w:t>Проверяется расчет 50% при заполнении половины высоты</w:t>
+            </w:r>
+          </w:p>
+        </w:tc>
+      </w:tr>
+      <w:tr>
+        <w:tc>
+          <w:tcPr>
+            <w:tcW w:w="2164" w:type="pct"/>
+          </w:tcPr>
+          <w:p>
+            <w:r>
+              <w:t>Вид теста</w:t>
+            </w:r>
+          </w:p>
+        </w:tc>
+        <w:tc>
+          <w:tcPr>
+            <w:tcW w:w="2836" w:type="pct"/>
+          </w:tcPr>
+          <w:p>
+            <w:r>
+              <w:t>Позитивный</w:t>
+            </w:r>
+          </w:p>
+        </w:tc>
+      </w:tr>
+      <w:tr>
+        <w:tc>
+          <w:tcPr>
+            <w:tcW w:w="2164" w:type="pct"/>
+          </w:tcPr>
+          <w:p>
+            <w:r>
+              <w:t>Тестовые данные</w:t>
+            </w:r>
+          </w:p>
+        </w:tc>
+        <w:tc>
+          <w:tcPr>
+            <w:tcW w:w="2836" w:type="pct"/>
+          </w:tcPr>
+          <w:p>
+            <w:proofErr w:type="spellStart"/>
+            <w:r>
+              <w:t>Height</w:t>
+            </w:r>
+            <w:proofErr w:type="spellEnd"/>
+            <w:r>
+              <w:t xml:space="preserve"> = 10, </w:t>
+            </w:r>
+            <w:proofErr w:type="spellStart"/>
+            <w:r>
+              <w:t>Diameter</w:t>
+            </w:r>
+            <w:proofErr w:type="spellEnd"/>
+            <w:r>
+              <w:t xml:space="preserve"> = 5, </w:t>
+            </w:r>
+            <w:proofErr w:type="spellStart"/>
+            <w:r>
+              <w:t>fillHeight</w:t>
+            </w:r>
+            <w:proofErr w:type="spellEnd"/>
+            <w:r>
+              <w:t xml:space="preserve"> = 5</w:t>
+            </w:r>
+          </w:p>
+        </w:tc>
+      </w:tr>
+      <w:tr>
+        <w:tc>
+          <w:tcPr>
+            <w:tcW w:w="2164" w:type="pct"/>
+          </w:tcPr>
+          <w:p>
+            <w:pPr>
+              <w:rPr>
+                <w:lang w:val="en-US"/>
+              </w:rPr>
+            </w:pPr>
+            <w:r>
+              <w:t>Название</w:t>
+            </w:r>
+            <w:r>
+              <w:rPr>
+                <w:lang w:val="en-US"/>
+              </w:rPr>
+              <w:t xml:space="preserve"> </w:t>
+            </w:r>
+            <w:r>
+              <w:t>тестового</w:t>
+            </w:r>
+            <w:r>
+              <w:rPr>
+                <w:lang w:val="en-US"/>
+              </w:rPr>
+              <w:t xml:space="preserve"> </w:t>
+            </w:r>
+            <w:r>
+              <w:t>метода</w:t>
+            </w:r>
+          </w:p>
+        </w:tc>
+        <w:tc>
+          <w:tcPr>
+            <w:tcW w:w="2836" w:type="pct"/>
+          </w:tcPr>
+          <w:p>
+            <w:pPr>
+              <w:rPr>
+                <w:lang w:val="en-US"/>
+              </w:rPr>
+            </w:pPr>
+            <w:r>
+              <w:rPr>
+                <w:lang w:val="en-US"/>
+              </w:rPr>
+              <w:t>Task12Cup_FillPercent_HalfFull_ReturnsFifty</w:t>
+            </w:r>
+          </w:p>
+        </w:tc>
+      </w:tr>
+      <w:tr>
+        <w:tc>
+          <w:tcPr>
+            <w:tcW w:w="2164" w:type="pct"/>
+          </w:tcPr>
+          <w:p>
+            <w:r>
+              <w:t>Ожидаемый результат</w:t>
+            </w:r>
+          </w:p>
+        </w:tc>
+        <w:tc>
+          <w:tcPr>
+            <w:tcW w:w="2836" w:type="pct"/>
+          </w:tcPr>
+          <w:p>
+            <w:r>
+              <w:t>Тест пройден. Метод вернет 50</w:t>
+            </w:r>
+          </w:p>
+        </w:tc>
+      </w:tr>
+      <w:tr>
+        <w:tc>
+          <w:tcPr>
+            <w:tcW w:w="2164" w:type="pct"/>
+          </w:tcPr>
+          <w:p>
+            <w:r>
+              <w:t>Полученный результат</w:t>
+            </w:r>
+          </w:p>
+        </w:tc>
+        <w:tc>
+          <w:tcPr>
+            <w:tcW w:w="2836" w:type="pct"/>
+          </w:tcPr>
+          <w:p>
+            <w:r>
+              <w:t>Тест пройден. Метод вернул 50</w:t>
+            </w:r>
+          </w:p>
+        </w:tc>
+      </w:tr>
+      <w:tr>
+        <w:tc>
+          <w:tcPr>
+            <w:tcW w:w="2164" w:type="pct"/>
+          </w:tcPr>
+          <w:p>
+            <w:r>
+              <w:t>Статус теста</w:t>
+            </w:r>
+          </w:p>
+        </w:tc>
+        <w:tc>
+          <w:tcPr>
+            <w:tcW w:w="2836" w:type="pct"/>
+          </w:tcPr>
+          <w:p>
+            <w:r>
+              <w:t>Прошёл</w:t>
+            </w:r>
+          </w:p>
+        </w:tc>
+      </w:tr>
+    </w:tbl>
+    <w:p/>
+    <w:tbl>
+      <w:tblPr>
+        <w:tblStyle w:val="TableGrid"/>
+        <w:tblW w:w="4995" w:type="pct"/>
+        <w:tblLook w:val="04A0" w:firstRow="1" w:lastRow="0" w:firstColumn="1" w:lastColumn="0" w:noHBand="0" w:noVBand="1"/>
+      </w:tblPr>
+      <w:tblGrid>
+        <w:gridCol w:w="4041"/>
+        <w:gridCol w:w="5295"/>
+      </w:tblGrid>
+      <w:tr>
+        <w:trPr>
+          <w:trHeight w:val="188"/>
+        </w:trPr>
+        <w:tc>
+          <w:tcPr>
+            <w:tcW w:w="2164" w:type="pct"/>
+            <w:shd w:val="clear" w:color="auto" w:fill="BFBFBF" w:themeFill="background1" w:themeFillShade="BF"/>
+          </w:tcPr>
+          <w:p>
+            <w:r>
+              <w:t>Порядковый номер #</w:t>
+            </w:r>
+          </w:p>
+        </w:tc>
+        <w:tc>
+          <w:tcPr>
+            <w:tcW w:w="2836" w:type="pct"/>
+            <w:shd w:val="clear" w:color="auto" w:fill="BFBFBF" w:themeFill="background1" w:themeFillShade="BF"/>
+          </w:tcPr>
+          <w:p>
+            <w:r>
+              <w:t>4</w:t>
+            </w:r>
+          </w:p>
+        </w:tc>
+      </w:tr>
+      <w:tr>
+        <w:tc>
+          <w:tcPr>
+            <w:tcW w:w="2164" w:type="pct"/>
+          </w:tcPr>
+          <w:p>
+            <w:r>
+              <w:t>Название класса</w:t>
+            </w:r>
+          </w:p>
+        </w:tc>
+        <w:tc>
+          <w:tcPr>
+            <w:tcW w:w="2836" w:type="pct"/>
+          </w:tcPr>
+          <w:p>
+            <w:r>
+              <w:t>Cup – стакан (цилиндр)</w:t>
+            </w:r>
+          </w:p>
+        </w:tc>
+      </w:tr>
+      <w:tr>
+        <w:tc>
+          <w:tcPr>
+            <w:tcW w:w="2164" w:type="pct"/>
+          </w:tcPr>
+          <w:p>
+            <w:r>
+              <w:t>Название метода</w:t>
+            </w:r>
+          </w:p>
+        </w:tc>
+        <w:tc>
+          <w:tcPr>
+            <w:tcW w:w="2836" w:type="pct"/>
+          </w:tcPr>
+          <w:p>
+            <w:proofErr w:type="spellStart"/>
+            <w:r>
+              <w:t>FillPercent</w:t>
+            </w:r>
+            <w:proofErr w:type="spellEnd"/>
+            <w:r>
+              <w:t xml:space="preserve"> – вычисляет процент заполнения</w:t>
+            </w:r>
+          </w:p>
+        </w:tc>
+      </w:tr>
+      <w:tr>
+        <w:tc>
+          <w:tcPr>
+            <w:tcW w:w="2164" w:type="pct"/>
+          </w:tcPr>
+          <w:p>
+            <w:r>
+              <w:t>Резюме тестирования</w:t>
+            </w:r>
+          </w:p>
+        </w:tc>
+        <w:tc>
+          <w:tcPr>
+            <w:tcW w:w="2836" w:type="pct"/>
+          </w:tcPr>
+          <w:p>
+            <w:r>
+              <w:t>Проверяется возврат 100% при полном заполнении</w:t>
+            </w:r>
+          </w:p>
+        </w:tc>
+      </w:tr>
+      <w:tr>
+        <w:tc>
+          <w:tcPr>
+            <w:tcW w:w="2164" w:type="pct"/>
+          </w:tcPr>
+          <w:p>
+            <w:r>
+              <w:t>Вид теста</w:t>
+            </w:r>
+          </w:p>
+        </w:tc>
+        <w:tc>
+          <w:tcPr>
+            <w:tcW w:w="2836" w:type="pct"/>
+          </w:tcPr>
+          <w:p>
+            <w:r>
+              <w:t>Позитивный (граничное значение)</w:t>
+            </w:r>
+          </w:p>
+        </w:tc>
+      </w:tr>
+      <w:tr>
+        <w:tc>
+          <w:tcPr>
+            <w:tcW w:w="2164" w:type="pct"/>
+          </w:tcPr>
+          <w:p>
+            <w:pPr>
+              <w:rPr>
+                <w:lang w:val="en-US"/>
+              </w:rPr>
+            </w:pPr>
+            <w:r>
+              <w:t>Тестовые</w:t>
+            </w:r>
+            <w:r>
+              <w:rPr>
+                <w:lang w:val="en-US"/>
+              </w:rPr>
+              <w:t xml:space="preserve"> </w:t>
+            </w:r>
+            <w:r>
+              <w:t>данные</w:t>
+            </w:r>
+          </w:p>
+        </w:tc>
+        <w:tc>
+          <w:tcPr>
+            <w:tcW w:w="2836" w:type="pct"/>
+          </w:tcPr>
+          <w:p>
+            <w:pPr>
+              <w:rPr>
+                <w:lang w:val="en-US"/>
+              </w:rPr>
+            </w:pPr>
+            <w:r>
+              <w:rPr>
+                <w:lang w:val="en-US"/>
+              </w:rPr>
+              <w:t xml:space="preserve">Height = 10, Diameter = 5, </w:t>
+            </w:r>
+            <w:proofErr w:type="spellStart"/>
+            <w:r>
+              <w:rPr>
+                <w:lang w:val="en-US"/>
+              </w:rPr>
+              <w:t>fillHeight</w:t>
+            </w:r>
+            <w:proofErr w:type="spellEnd"/>
+            <w:r>
+              <w:rPr>
+                <w:lang w:val="en-US"/>
+              </w:rPr>
+              <w:t xml:space="preserve"> = 10</w:t>
+            </w:r>
+          </w:p>
+        </w:tc>
+      </w:tr>
+      <w:tr>
+        <w:tc>
+          <w:tcPr>
+            <w:tcW w:w="2164" w:type="pct"/>
+          </w:tcPr>
+          <w:p>
+            <w:pPr>
+              <w:rPr>
+                <w:lang w:val="en-US"/>
+              </w:rPr>
+            </w:pPr>
+            <w:r>
+              <w:t>Название</w:t>
+            </w:r>
+            <w:r>
+              <w:rPr>
+                <w:lang w:val="en-US"/>
+              </w:rPr>
+              <w:t xml:space="preserve"> </w:t>
+            </w:r>
+            <w:r>
+              <w:t>тестового</w:t>
+            </w:r>
+            <w:r>
+              <w:rPr>
+                <w:lang w:val="en-US"/>
+              </w:rPr>
+              <w:t xml:space="preserve"> </w:t>
+            </w:r>
+            <w:r>
+              <w:t>метода</w:t>
+            </w:r>
+          </w:p>
+        </w:tc>
+        <w:tc>
+          <w:tcPr>
+            <w:tcW w:w="2836" w:type="pct"/>
+          </w:tcPr>
+          <w:p>
+            <w:pPr>
+              <w:rPr>
+                <w:lang w:val="en-US"/>
+              </w:rPr>
+            </w:pPr>
+            <w:r>
+              <w:rPr>
+                <w:lang w:val="en-US"/>
+              </w:rPr>
+              <w:t>Task12Cup_FillPercent_FullCup_ReturnsHundred</w:t>
+            </w:r>
+          </w:p>
+        </w:tc>
+      </w:tr>
+      <w:tr>
+        <w:tc>
+          <w:tcPr>
+            <w:tcW w:w="2164" w:type="pct"/>
+          </w:tcPr>
+          <w:p>
+            <w:r>
+              <w:t>Ожидаемый результат</w:t>
+            </w:r>
+          </w:p>
+        </w:tc>
+        <w:tc>
+          <w:tcPr>
+            <w:tcW w:w="2836" w:type="pct"/>
+          </w:tcPr>
+          <w:p>
+            <w:r>
+              <w:t>Тест пройден. Метод вернет 100</w:t>
+            </w:r>
+          </w:p>
+        </w:tc>
+      </w:tr>
+      <w:tr>
+        <w:tc>
+          <w:tcPr>
+            <w:tcW w:w="2164" w:type="pct"/>
+          </w:tcPr>
+          <w:p>
+            <w:r>
+              <w:t>Полученный результат</w:t>
+            </w:r>
+          </w:p>
+        </w:tc>
+        <w:tc>
+          <w:tcPr>
+            <w:tcW w:w="2836" w:type="pct"/>
+          </w:tcPr>
+          <w:p>
+            <w:r>
+              <w:t>Тест пройден. Метод вернул 100</w:t>
+            </w:r>
+          </w:p>
+        </w:tc>
+      </w:tr>
+      <w:tr>
+        <w:tc>
+          <w:tcPr>
+            <w:tcW w:w="2164" w:type="pct"/>
+          </w:tcPr>
+          <w:p>
+            <w:r>
+              <w:t>Статус теста</w:t>
+            </w:r>
+          </w:p>
+        </w:tc>
+        <w:tc>
+          <w:tcPr>
+            <w:tcW w:w="2836" w:type="pct"/>
+          </w:tcPr>
+          <w:p>
+            <w:r>
+              <w:t>Прошёл</w:t>
+            </w:r>
+          </w:p>
+        </w:tc>
+      </w:tr>
+    </w:tbl>
+    <w:p/>
+    <w:tbl>
+      <w:tblPr>
+        <w:tblStyle w:val="TableGrid"/>
+        <w:tblW w:w="4995" w:type="pct"/>
+        <w:tblLook w:val="04A0" w:firstRow="1" w:lastRow="0" w:firstColumn="1" w:lastColumn="0" w:noHBand="0" w:noVBand="1"/>
+      </w:tblPr>
+      <w:tblGrid>
+        <w:gridCol w:w="4041"/>
+        <w:gridCol w:w="5295"/>
+      </w:tblGrid>
+      <w:tr>
+        <w:tc>
+          <w:tcPr>
+            <w:tcW w:w="2164" w:type="pct"/>
+            <w:shd w:val="clear" w:color="auto" w:fill="BFBFBF" w:themeFill="background1" w:themeFillShade="BF"/>
+          </w:tcPr>
+          <w:p>
+            <w:r>
+              <w:t>Порядковый номер #</w:t>
+            </w:r>
+          </w:p>
+        </w:tc>
+        <w:tc>
+          <w:tcPr>
+            <w:tcW w:w="2836" w:type="pct"/>
+            <w:shd w:val="clear" w:color="auto" w:fill="BFBFBF" w:themeFill="background1" w:themeFillShade="BF"/>
+          </w:tcPr>
+          <w:p>
+            <w:r>
+              <w:t>5</w:t>
+            </w:r>
+          </w:p>
+        </w:tc>
+      </w:tr>
+      <w:tr>
+        <w:tc>
+          <w:tcPr>
+            <w:tcW w:w="2164" w:type="pct"/>
+          </w:tcPr>
+          <w:p>
+            <w:r>
+              <w:lastRenderedPageBreak/>
+              <w:t>Название класса</w:t>
+            </w:r>
+          </w:p>
+        </w:tc>
+        <w:tc>
+          <w:tcPr>
+            <w:tcW w:w="2836" w:type="pct"/>
+          </w:tcPr>
+          <w:p>
+            <w:r>
+              <w:t>Cup – стакан (цилиндр)</w:t>
+            </w:r>
+          </w:p>
+        </w:tc>
+      </w:tr>
+      <w:tr>
+        <w:tc>
+          <w:tcPr>
+            <w:tcW w:w="2164" w:type="pct"/>
+          </w:tcPr>
+          <w:p>
+            <w:r>
+              <w:t>Название метода</w:t>
+            </w:r>
+          </w:p>
+        </w:tc>
+        <w:tc>
+          <w:tcPr>
+            <w:tcW w:w="2836" w:type="pct"/>
+          </w:tcPr>
+          <w:p>
+            <w:proofErr w:type="spellStart"/>
+            <w:r>
+              <w:t>FillPercent</w:t>
+            </w:r>
+            <w:proofErr w:type="spellEnd"/>
+            <w:r>
+              <w:t xml:space="preserve"> – вычисляет процент заполнения</w:t>
+            </w:r>
+          </w:p>
+        </w:tc>
+      </w:tr>
+      <w:tr>
+        <w:tc>
+          <w:tcPr>
+            <w:tcW w:w="2164" w:type="pct"/>
+          </w:tcPr>
+          <w:p>
+            <w:r>
+              <w:t>Резюме тестирования</w:t>
+            </w:r>
+          </w:p>
+        </w:tc>
+        <w:tc>
+          <w:tcPr>
+            <w:tcW w:w="2836" w:type="pct"/>
+          </w:tcPr>
+          <w:p>
+            <w:r>
+              <w:t>Проверяется обработка перелива: высота жидкости больше высоты стакана</w:t>
+            </w:r>
+          </w:p>
+        </w:tc>
+      </w:tr>
+      <w:tr>
+        <w:tc>
+          <w:tcPr>
+            <w:tcW w:w="2164" w:type="pct"/>
+          </w:tcPr>
+          <w:p>
+            <w:r>
+              <w:t>Вид теста</w:t>
+            </w:r>
+          </w:p>
+        </w:tc>
+        <w:tc>
+          <w:tcPr>
+            <w:tcW w:w="2836" w:type="pct"/>
+          </w:tcPr>
+          <w:p>
+            <w:r>
+              <w:t>Позитивный (защита от некорректных данных)</w:t>
+            </w:r>
+          </w:p>
+        </w:tc>
+      </w:tr>
+      <w:tr>
+        <w:tc>
+          <w:tcPr>
+            <w:tcW w:w="2164" w:type="pct"/>
+          </w:tcPr>
+          <w:p>
+            <w:pPr>
+              <w:rPr>
+                <w:lang w:val="en-US"/>
+              </w:rPr>
+            </w:pPr>
+            <w:r>
+              <w:t>Тестовые</w:t>
+            </w:r>
+            <w:r>
+              <w:rPr>
+                <w:lang w:val="en-US"/>
+              </w:rPr>
+              <w:t xml:space="preserve"> </w:t>
+            </w:r>
+            <w:r>
+              <w:t>данные</w:t>
+            </w:r>
+          </w:p>
+        </w:tc>
+        <w:tc>
+          <w:tcPr>
+            <w:tcW w:w="2836" w:type="pct"/>
+          </w:tcPr>
+          <w:p>
+            <w:pPr>
+              <w:rPr>
+                <w:lang w:val="en-US"/>
+              </w:rPr>
+            </w:pPr>
+            <w:r>
+              <w:rPr>
+                <w:lang w:val="en-US"/>
+              </w:rPr>
+              <w:t xml:space="preserve">Height = 10, Diameter = 5, </w:t>
+            </w:r>
+            <w:proofErr w:type="spellStart"/>
+            <w:r>
+              <w:rPr>
+                <w:lang w:val="en-US"/>
+              </w:rPr>
+              <w:t>fillHeight</w:t>
+            </w:r>
+            <w:proofErr w:type="spellEnd"/>
+            <w:r>
+              <w:rPr>
+                <w:lang w:val="en-US"/>
+              </w:rPr>
+              <w:t xml:space="preserve"> = 15</w:t>
+            </w:r>
+          </w:p>
+        </w:tc>
+      </w:tr>
+      <w:tr>
+        <w:tc>
+          <w:tcPr>
+            <w:tcW w:w="2164" w:type="pct"/>
+          </w:tcPr>
+          <w:p>
+            <w:pPr>
+              <w:rPr>
+                <w:lang w:val="en-US"/>
+              </w:rPr>
+            </w:pPr>
+            <w:r>
+              <w:t>Название</w:t>
+            </w:r>
+            <w:r>
+              <w:rPr>
+                <w:lang w:val="en-US"/>
+              </w:rPr>
+              <w:t xml:space="preserve"> </w:t>
+            </w:r>
+            <w:r>
+              <w:t>тестового</w:t>
+            </w:r>
+            <w:r>
+              <w:rPr>
+                <w:lang w:val="en-US"/>
+              </w:rPr>
+              <w:t xml:space="preserve"> </w:t>
+            </w:r>
+            <w:r>
+              <w:t>метода</w:t>
+            </w:r>
+          </w:p>
+        </w:tc>
+        <w:tc>
+          <w:tcPr>
+            <w:tcW w:w="2836" w:type="pct"/>
+          </w:tcPr>
+          <w:p>
+            <w:pPr>
+              <w:rPr>
+                <w:lang w:val="en-US"/>
+              </w:rPr>
+            </w:pPr>
+            <w:r>
+              <w:rPr>
+                <w:lang w:val="en-US"/>
+              </w:rPr>
+              <w:t>Task12Cup_FillPercent_Overflow_ReturnsHundred</w:t>
+            </w:r>
+          </w:p>
+        </w:tc>
+      </w:tr>
+      <w:tr>
+        <w:tc>
+          <w:tcPr>
+            <w:tcW w:w="2164" w:type="pct"/>
+          </w:tcPr>
+          <w:p>
+            <w:r>
+              <w:t>Ожидаемый результат</w:t>
+            </w:r>
+          </w:p>
+        </w:tc>
+        <w:tc>
+          <w:tcPr>
+            <w:tcW w:w="2836" w:type="pct"/>
+          </w:tcPr>
+          <w:p>
+            <w:r>
+              <w:t>Тест пройден. Метод вернет 100 (ограничение сверху)</w:t>
+            </w:r>
+          </w:p>
+        </w:tc>
+      </w:tr>
+      <w:tr>
+        <w:tc>
+          <w:tcPr>
+            <w:tcW w:w="2164" w:type="pct"/>
+          </w:tcPr>
+          <w:p>
+            <w:r>
+              <w:t>Полученный результат</w:t>
+            </w:r>
+          </w:p>
+        </w:tc>
+        <w:tc>
+          <w:tcPr>
+            <w:tcW w:w="2836" w:type="pct"/>
+          </w:tcPr>
+          <w:p>
+            <w:r>
+              <w:t>Тест пройден. Метод вернул 100</w:t>
+            </w:r>
+          </w:p>
+        </w:tc>
+      </w:tr>
+      <w:tr>
+        <w:tc>
+          <w:tcPr>
+            <w:tcW w:w="2164" w:type="pct"/>
+          </w:tcPr>
+          <w:p>
+            <w:r>
+              <w:t>Статус теста</w:t>
+            </w:r>
+          </w:p>
+        </w:tc>
+        <w:tc>
+          <w:tcPr>
+            <w:tcW w:w="2836" w:type="pct"/>
+          </w:tcPr>
+          <w:p>
+            <w:r>
+              <w:t>Прошёл</w:t>
+            </w:r>
+          </w:p>
+        </w:tc>
+      </w:tr>
+    </w:tbl>
+    <w:p/>
+    <w:tbl>
+      <w:tblPr>
+        <w:tblStyle w:val="TableGrid"/>
+        <w:tblW w:w="4995" w:type="pct"/>
+        <w:tblLook w:val="04A0" w:firstRow="1" w:lastRow="0" w:firstColumn="1" w:lastColumn="0" w:noHBand="0" w:noVBand="1"/>
+      </w:tblPr>
+      <w:tblGrid>
+        <w:gridCol w:w="4041"/>
+        <w:gridCol w:w="5295"/>
+      </w:tblGrid>
+      <w:tr>
+        <w:tc>
+          <w:tcPr>
+            <w:tcW w:w="2164" w:type="pct"/>
+            <w:shd w:val="clear" w:color="auto" w:fill="BFBFBF" w:themeFill="background1" w:themeFillShade="BF"/>
+          </w:tcPr>
+          <w:p>
+            <w:r>
+              <w:t>Порядковый номер #</w:t>
+            </w:r>
+          </w:p>
+        </w:tc>
+        <w:tc>
+          <w:tcPr>
+            <w:tcW w:w="2836" w:type="pct"/>
+            <w:shd w:val="clear" w:color="auto" w:fill="BFBFBF" w:themeFill="background1" w:themeFillShade="BF"/>
+          </w:tcPr>
+          <w:p>
+            <w:r>
+              <w:t>6</w:t>
+            </w:r>
+          </w:p>
+        </w:tc>
+      </w:tr>
+      <w:tr>
+        <w:tc>
+          <w:tcPr>
+            <w:tcW w:w="2164" w:type="pct"/>
+          </w:tcPr>
+          <w:p>
+            <w:r>
+              <w:t>Название класса</w:t>
+            </w:r>
+          </w:p>
+        </w:tc>
+        <w:tc>
+          <w:tcPr>
+            <w:tcW w:w="2836" w:type="pct"/>
+          </w:tcPr>
+          <w:p>
+            <w:r>
+              <w:t>Cup – стакан (цилиндр)</w:t>
+            </w:r>
+          </w:p>
+        </w:tc>
+      </w:tr>
+      <w:tr>
+        <w:tc>
+          <w:tcPr>
+            <w:tcW w:w="2164" w:type="pct"/>
+          </w:tcPr>
+          <w:p>
+            <w:r>
+              <w:t>Название метода</w:t>
+            </w:r>
+          </w:p>
+        </w:tc>
+        <w:tc>
+          <w:tcPr>
+            <w:tcW w:w="2836" w:type="pct"/>
+          </w:tcPr>
+          <w:p>
+            <w:proofErr w:type="spellStart"/>
+            <w:r>
+              <w:t>LiquidMass</w:t>
+            </w:r>
+            <w:proofErr w:type="spellEnd"/>
+            <w:r>
+              <w:t xml:space="preserve"> – вычисляет массу жидкости</w:t>
+            </w:r>
+          </w:p>
+        </w:tc>
+      </w:tr>
+      <w:tr>
+        <w:tc>
+          <w:tcPr>
+            <w:tcW w:w="2164" w:type="pct"/>
+          </w:tcPr>
+          <w:p>
+            <w:r>
+              <w:t>Резюме тестирования</w:t>
+            </w:r>
+          </w:p>
+        </w:tc>
+        <w:tc>
+          <w:tcPr>
+            <w:tcW w:w="2836" w:type="pct"/>
+          </w:tcPr>
+          <w:p>
+            <w:r>
+              <w:t>Проверяется возврат массы 0 при высоте жидкости 0</w:t>
+            </w:r>
+          </w:p>
+        </w:tc>
+      </w:tr>
+      <w:tr>
+        <w:tc>
+          <w:tcPr>
+            <w:tcW w:w="2164" w:type="pct"/>
+          </w:tcPr>
+          <w:p>
+            <w:r>
+              <w:t>Вид теста</w:t>
+            </w:r>
+          </w:p>
+        </w:tc>
+        <w:tc>
+          <w:tcPr>
+            <w:tcW w:w="2836" w:type="pct"/>
+          </w:tcPr>
+          <w:p>
+            <w:r>
+              <w:t>Позитивный (граничное значение)</w:t>
+            </w:r>
+          </w:p>
+        </w:tc>
+      </w:tr>
+      <w:tr>
+        <w:tc>
+          <w:tcPr>
+            <w:tcW w:w="2164" w:type="pct"/>
+          </w:tcPr>
+          <w:p>
+            <w:pPr>
+              <w:rPr>
+                <w:lang w:val="en-US"/>
+              </w:rPr>
+            </w:pPr>
+            <w:r>
+              <w:t>Тестовые</w:t>
+            </w:r>
+            <w:r>
+              <w:rPr>
+                <w:lang w:val="en-US"/>
+              </w:rPr>
+              <w:t xml:space="preserve"> </w:t>
+            </w:r>
+            <w:r>
+              <w:t>данные</w:t>
+            </w:r>
+          </w:p>
+        </w:tc>
+        <w:tc>
+          <w:tcPr>
+            <w:tcW w:w="2836" w:type="pct"/>
+          </w:tcPr>
+          <w:p>
+            <w:pPr>
+              <w:rPr>
+                <w:lang w:val="en-US"/>
+              </w:rPr>
+            </w:pPr>
+            <w:r>
+              <w:rPr>
+                <w:lang w:val="en-US"/>
+              </w:rPr>
+              <w:t xml:space="preserve">Height = 10, Diameter = 5, </w:t>
+            </w:r>
+            <w:proofErr w:type="spellStart"/>
+            <w:r>
+              <w:rPr>
+                <w:lang w:val="en-US"/>
+              </w:rPr>
+              <w:t>fillHeight</w:t>
+            </w:r>
+            <w:proofErr w:type="spellEnd"/>
+            <w:r>
+              <w:rPr>
+                <w:lang w:val="en-US"/>
+              </w:rPr>
+              <w:t xml:space="preserve"> = 0, density = 1.0</w:t>
+            </w:r>
+          </w:p>
+        </w:tc>
+      </w:tr>
+      <w:tr>
+        <w:tc>
+          <w:tcPr>
+            <w:tcW w:w="2164" w:type="pct"/>
+          </w:tcPr>
+          <w:p>
+            <w:pPr>
+              <w:rPr>
+                <w:lang w:val="en-US"/>
+              </w:rPr>
+            </w:pPr>
+            <w:r>
+              <w:t>Название</w:t>
+            </w:r>
+            <w:r>
+              <w:rPr>
+                <w:lang w:val="en-US"/>
+              </w:rPr>
+              <w:t xml:space="preserve"> </w:t>
+            </w:r>
+            <w:r>
+              <w:t>тестового</w:t>
+            </w:r>
+            <w:r>
+              <w:rPr>
+                <w:lang w:val="en-US"/>
+              </w:rPr>
+              <w:t xml:space="preserve"> </w:t>
+            </w:r>
+            <w:r>
+              <w:t>метода</w:t>
+            </w:r>
+          </w:p>
+        </w:tc>
+        <w:tc>
+          <w:tcPr>
+            <w:tcW w:w="2836" w:type="pct"/>
+          </w:tcPr>
+          <w:p>
+            <w:pPr>
+              <w:rPr>
+                <w:lang w:val="en-US"/>
+              </w:rPr>
+            </w:pPr>
+            <w:r>
+              <w:rPr>
+                <w:lang w:val="en-US"/>
+              </w:rPr>
+              <w:t>Task12Cup_LiquidMass_ZeroHeight_ReturnsZero</w:t>
+            </w:r>
+          </w:p>
+        </w:tc>
+      </w:tr>
+      <w:tr>
+        <w:tc>
+          <w:tcPr>
+            <w:tcW w:w="2164" w:type="pct"/>
+          </w:tcPr>
+          <w:p>
+            <w:r>
+              <w:t>Ожидаемый результат</w:t>
+            </w:r>
+          </w:p>
+        </w:tc>
+        <w:tc>
+          <w:tcPr>
+            <w:tcW w:w="2836" w:type="pct"/>
+          </w:tcPr>
+          <w:p>
+            <w:r>
+              <w:t>Тест пройден. Метод вернет 0</w:t>
+            </w:r>
+          </w:p>
+        </w:tc>
+      </w:tr>
+      <w:tr>
+        <w:tc>
+          <w:tcPr>
+            <w:tcW w:w="2164" w:type="pct"/>
+          </w:tcPr>
+          <w:p>
+            <w:r>
+              <w:t>Полученный результат</w:t>
+            </w:r>
+          </w:p>
+        </w:tc>
+        <w:tc>
+          <w:tcPr>
+            <w:tcW w:w="2836" w:type="pct"/>
+          </w:tcPr>
+          <w:p>
+            <w:r>
+              <w:t>Тест пройден. Метод вернул 0</w:t>
+            </w:r>
+          </w:p>
+        </w:tc>
+      </w:tr>
+      <w:tr>
+        <w:tc>
+          <w:tcPr>
+            <w:tcW w:w="2164" w:type="pct"/>
+          </w:tcPr>
+          <w:p>
+            <w:r>
+              <w:t>Статус теста</w:t>
+            </w:r>
+          </w:p>
+        </w:tc>
+        <w:tc>
+          <w:tcPr>
+            <w:tcW w:w="2836" w:type="pct"/>
+          </w:tcPr>
+          <w:p>
+            <w:r>
+              <w:t>Прошёл</w:t>
+            </w:r>
+          </w:p>
+        </w:tc>
+      </w:tr>
+    </w:tbl>
+    <w:p/>
+    <w:tbl>
+      <w:tblPr>
+        <w:tblStyle w:val="TableGrid"/>
+        <w:tblW w:w="4995" w:type="pct"/>
+        <w:tblLook w:val="04A0" w:firstRow="1" w:lastRow="0" w:firstColumn="1" w:lastColumn="0" w:noHBand="0" w:noVBand="1"/>
+      </w:tblPr>
+      <w:tblGrid>
+        <w:gridCol w:w="4040"/>
+        <w:gridCol w:w="5296"/>
+      </w:tblGrid>
+      <w:tr>
+        <w:tc>
+          <w:tcPr>
+            <w:tcW w:w="2164" w:type="pct"/>
+            <w:shd w:val="clear" w:color="auto" w:fill="BFBFBF" w:themeFill="background1" w:themeFillShade="BF"/>
+          </w:tcPr>
+          <w:p>
+            <w:r>
+              <w:t>Порядковый номер #</w:t>
+            </w:r>
+          </w:p>
+        </w:tc>
+        <w:tc>
+          <w:tcPr>
+            <w:tcW w:w="2836" w:type="pct"/>
+            <w:shd w:val="clear" w:color="auto" w:fill="BFBFBF" w:themeFill="background1" w:themeFillShade="BF"/>
+          </w:tcPr>
+          <w:p>
+            <w:r>
+              <w:t>7</w:t>
+            </w:r>
+          </w:p>
+        </w:tc>
+      </w:tr>
+      <w:tr>
+        <w:tc>
+          <w:tcPr>
+            <w:tcW w:w="2164" w:type="pct"/>
+          </w:tcPr>
+          <w:p>
+            <w:r>
+              <w:t>Название класса</w:t>
+            </w:r>
+          </w:p>
+        </w:tc>
+        <w:tc>
+          <w:tcPr>
+            <w:tcW w:w="2836" w:type="pct"/>
+          </w:tcPr>
+          <w:p>
+            <w:r>
+              <w:t>Cup – стакан (цилиндр)</w:t>
+            </w:r>
+          </w:p>
+        </w:tc>
+      </w:tr>
+      <w:tr>
+        <w:tc>
+          <w:tcPr>
+            <w:tcW w:w="2164" w:type="pct"/>
+          </w:tcPr>
+          <w:p>
+            <w:r>
+              <w:t>Название метода</w:t>
+            </w:r>
+          </w:p>
+        </w:tc>
+        <w:tc>
+          <w:tcPr>
+            <w:tcW w:w="2836" w:type="pct"/>
+          </w:tcPr>
+          <w:p>
+            <w:proofErr w:type="spellStart"/>
+            <w:r>
+              <w:t>LiquidMass</w:t>
+            </w:r>
+            <w:proofErr w:type="spellEnd"/>
+            <w:r>
+              <w:t xml:space="preserve"> – вычисляет массу жидкости</w:t>
+            </w:r>
+          </w:p>
+        </w:tc>
+      </w:tr>
+      <w:tr>
+        <w:tc>
+          <w:tcPr>
+            <w:tcW w:w="2164" w:type="pct"/>
+          </w:tcPr>
+          <w:p>
+            <w:r>
+              <w:t>Резюме тестирования</w:t>
+            </w:r>
+          </w:p>
+        </w:tc>
+        <w:tc>
+          <w:tcPr>
+            <w:tcW w:w="2836" w:type="pct"/>
+          </w:tcPr>
+          <w:p>
+            <w:r>
+              <w:t>Проверяется корректный расчет массы при половине высоты и плотности 1.0</w:t>
+            </w:r>
+          </w:p>
+        </w:tc>
+      </w:tr>
+      <w:tr>
+        <w:tc>
+          <w:tcPr>
+            <w:tcW w:w="2164" w:type="pct"/>
+          </w:tcPr>
+          <w:p>
+            <w:r>
+              <w:t>Вид теста</w:t>
+            </w:r>
+          </w:p>
+        </w:tc>
+        <w:tc>
+          <w:tcPr>
+            <w:tcW w:w="2836" w:type="pct"/>
+          </w:tcPr>
+          <w:p>
+            <w:r>
+              <w:t>Позитивный</w:t>
+            </w:r>
+          </w:p>
+        </w:tc>
+      </w:tr>
+      <w:tr>
+        <w:tc>
+          <w:tcPr>
+            <w:tcW w:w="2164" w:type="pct"/>
+          </w:tcPr>
+          <w:p>
+            <w:r>
+              <w:t>Тестовые данные</w:t>
+            </w:r>
+          </w:p>
+        </w:tc>
+        <w:tc>
+          <w:tcPr>
+            <w:tcW w:w="2836" w:type="pct"/>
+          </w:tcPr>
+          <w:p>
+            <w:proofErr w:type="spellStart"/>
+            <w:r>
+              <w:t>Height</w:t>
+            </w:r>
+            <w:proofErr w:type="spellEnd"/>
+            <w:r>
+              <w:t xml:space="preserve"> = 10, </w:t>
+            </w:r>
+            <w:proofErr w:type="spellStart"/>
+            <w:r>
+              <w:t>Diameter</w:t>
+            </w:r>
+            <w:proofErr w:type="spellEnd"/>
+            <w:r>
+              <w:t xml:space="preserve"> = 5, </w:t>
+            </w:r>
+            <w:proofErr w:type="spellStart"/>
+            <w:r>
+              <w:t>fillHeight</w:t>
+            </w:r>
+            <w:proofErr w:type="spellEnd"/>
+            <w:r>
+              <w:t xml:space="preserve"> = 5, </w:t>
+            </w:r>
+            <w:proofErr w:type="spellStart"/>
+            <w:r>
+              <w:t>density</w:t>
+            </w:r>
+            <w:proofErr w:type="spellEnd"/>
+            <w:r>
+              <w:t xml:space="preserve"> = 1.0</w:t>
+            </w:r>
+          </w:p>
+        </w:tc>
+      </w:tr>
+      <w:tr>
+        <w:tc>
+          <w:tcPr>
+            <w:tcW w:w="2164" w:type="pct"/>
+          </w:tcPr>
+          <w:p>
+            <w:pPr>
+              <w:rPr>
+                <w:lang w:val="en-US"/>
+              </w:rPr>
+            </w:pPr>
+            <w:r>
+              <w:t>Название</w:t>
+            </w:r>
+            <w:r>
+              <w:rPr>
+                <w:lang w:val="en-US"/>
+              </w:rPr>
+              <w:t xml:space="preserve"> </w:t>
+            </w:r>
+            <w:r>
+              <w:t>тестового</w:t>
+            </w:r>
+            <w:r>
+              <w:rPr>
+                <w:lang w:val="en-US"/>
+              </w:rPr>
+              <w:t xml:space="preserve"> </w:t>
+            </w:r>
+            <w:r>
+              <w:t>метода</w:t>
+            </w:r>
+          </w:p>
+        </w:tc>
+        <w:tc>
+          <w:tcPr>
+            <w:tcW w:w="2836" w:type="pct"/>
+          </w:tcPr>
+          <w:p>
+            <w:pPr>
+              <w:rPr>
+                <w:lang w:val="en-US"/>
+              </w:rPr>
+            </w:pPr>
+            <w:r>
+              <w:rPr>
+                <w:lang w:val="en-US"/>
+              </w:rPr>
+              <w:t>Task12Cup_LiquidMass_HalfHeight_ReturnsCorrectMass</w:t>
+            </w:r>
+          </w:p>
+        </w:tc>
+      </w:tr>
+      <w:tr>
+        <w:tc>
+          <w:tcPr>
+            <w:tcW w:w="2164" w:type="pct"/>
+          </w:tcPr>
+          <w:p>
+            <w:r>
+              <w:t>Ожидаемый результат</w:t>
+            </w:r>
+          </w:p>
+        </w:tc>
+        <w:tc>
+          <w:tcPr>
+            <w:tcW w:w="2836" w:type="pct"/>
+          </w:tcPr>
+          <w:p>
+            <w:r>
+              <w:t>Тест пройден. Метод вернет значение ≈ 98.17 (1.0 * π * 2.5^2 * 5)</w:t>
+            </w:r>
+          </w:p>
+        </w:tc>
+      </w:tr>
+      <w:tr>
+        <w:tc>
+          <w:tcPr>
+            <w:tcW w:w="2164" w:type="pct"/>
+          </w:tcPr>
+          <w:p>
+            <w:r>
+              <w:t>Полученный результат</w:t>
+            </w:r>
+          </w:p>
+        </w:tc>
+        <w:tc>
+          <w:tcPr>
+            <w:tcW w:w="2836" w:type="pct"/>
+          </w:tcPr>
+          <w:p>
+            <w:r>
+              <w:t>Тест пройден. Метод вернул ≈ 98.17</w:t>
+            </w:r>
+          </w:p>
+        </w:tc>
+      </w:tr>
+      <w:tr>
+        <w:tc>
+          <w:tcPr>
+            <w:tcW w:w="2164" w:type="pct"/>
+          </w:tcPr>
+          <w:p>
+            <w:r>
+              <w:t>Статус теста</w:t>
+            </w:r>
+          </w:p>
+        </w:tc>
+        <w:tc>
+          <w:tcPr>
+            <w:tcW w:w="2836" w:type="pct"/>
+          </w:tcPr>
+          <w:p>
+            <w:r>
+              <w:t>Прошёл</w:t>
+            </w:r>
+          </w:p>
+        </w:tc>
+      </w:tr>
+    </w:tbl>
+    <w:p/>
     <w:sectPr>
       <w:pgSz w:w="11906" w:h="16838"/>
       <w:pgMar w:top="1134" w:right="850" w:bottom="1134" w:left="1701" w:header="708" w:footer="708" w:gutter="0"/>
@@ -895,7 +2993,7 @@
 </file>
 
 <file path=word/styles.xml><?xml version="1.0" encoding="utf-8"?>
-<w:styles xmlns:mc="http://schemas.openxmlformats.org/markup-compatibility/2006" xmlns:r="http://schemas.openxmlformats.org/officeDocument/2006/relationships" xmlns:w="http://schemas.openxmlformats.org/wordprocessingml/2006/main" xmlns:w14="http://schemas.microsoft.com/office/word/2010/wordml" xmlns:w15="http://schemas.microsoft.com/office/word/2012/wordml" xmlns:w16cid="http://schemas.microsoft.com/office/word/2016/wordml/cid" xmlns:w16se="http://schemas.microsoft.com/office/word/2015/wordml/symex" mc:Ignorable="w14 w15 w16se w16cid">
+<w:styles xmlns:mc="http://schemas.openxmlformats.org/markup-compatibility/2006" xmlns:r="http://schemas.openxmlformats.org/officeDocument/2006/relationships" xmlns:w="http://schemas.openxmlformats.org/wordprocessingml/2006/main" xmlns:w14="http://schemas.microsoft.com/office/word/2010/wordml" xmlns:w15="http://schemas.microsoft.com/office/word/2012/wordml" xmlns:w16cex="http://schemas.microsoft.com/office/word/2018/wordml/cex" xmlns:w16cid="http://schemas.microsoft.com/office/word/2016/wordml/cid" xmlns:w16="http://schemas.microsoft.com/office/word/2018/wordml" xmlns:w16du="http://schemas.microsoft.com/office/word/2023/wordml/word16du" xmlns:w16sdtdh="http://schemas.microsoft.com/office/word/2020/wordml/sdtdatahash" xmlns:w16sdtfl="http://schemas.microsoft.com/office/word/2024/wordml/sdtformatlock" xmlns:w16se="http://schemas.microsoft.com/office/word/2015/wordml/symex" mc:Ignorable="w14 w15 w16se w16cid w16 w16cex w16sdtdh w16sdtfl w16du">
   <w:docDefaults>
     <w:rPrDefault>
       <w:rPr>
@@ -911,7 +3009,7 @@
       </w:pPr>
     </w:pPrDefault>
   </w:docDefaults>
-  <w:latentStyles w:defLockedState="0" w:defUIPriority="99" w:defSemiHidden="0" w:defUnhideWhenUsed="0" w:defQFormat="0" w:count="377">
+  <w:latentStyles w:defLockedState="0" w:defUIPriority="99" w:defSemiHidden="0" w:defUnhideWhenUsed="0" w:defQFormat="0" w:count="376">
     <w:lsdException w:name="Normal" w:uiPriority="0" w:qFormat="1"/>
     <w:lsdException w:name="heading 1" w:uiPriority="9" w:qFormat="1"/>
     <w:lsdException w:name="heading 2" w:semiHidden="1" w:uiPriority="9" w:unhideWhenUsed="1" w:qFormat="1"/>
@@ -1288,19 +3386,39 @@
     <w:lsdException w:name="Hashtag" w:semiHidden="1" w:unhideWhenUsed="1"/>
     <w:lsdException w:name="Unresolved Mention" w:semiHidden="1" w:unhideWhenUsed="1"/>
     <w:lsdException w:name="Smart Link" w:semiHidden="1" w:unhideWhenUsed="1"/>
-    <w:lsdException w:name="Smart Link Error" w:semiHidden="1" w:unhideWhenUsed="1"/>
   </w:latentStyles>
-  <w:style w:type="paragraph" w:default="1" w:styleId="a">
+  <w:style w:type="paragraph" w:default="1" w:styleId="Normal">
     <w:name w:val="Normal"/>
     <w:qFormat/>
   </w:style>
-  <w:style w:type="character" w:default="1" w:styleId="a0">
+  <w:style w:type="paragraph" w:styleId="Heading1">
+    <w:name w:val="heading 1"/>
+    <w:basedOn w:val="Normal"/>
+    <w:next w:val="Normal"/>
+    <w:link w:val="Heading1Char"/>
+    <w:uiPriority w:val="9"/>
+    <w:qFormat/>
+    <w:rsid w:val="004D1052"/>
+    <w:pPr>
+      <w:keepNext/>
+      <w:keepLines/>
+      <w:spacing w:before="240" w:after="0"/>
+      <w:outlineLvl w:val="0"/>
+    </w:pPr>
+    <w:rPr>
+      <w:rFonts w:asciiTheme="majorHAnsi" w:eastAsiaTheme="majorEastAsia" w:hAnsiTheme="majorHAnsi" w:cstheme="majorBidi"/>
+      <w:color w:val="000000" w:themeColor="text1"/>
+      <w:sz w:val="32"/>
+      <w:szCs w:val="32"/>
+    </w:rPr>
+  </w:style>
+  <w:style w:type="character" w:default="1" w:styleId="DefaultParagraphFont">
     <w:name w:val="Default Paragraph Font"/>
     <w:uiPriority w:val="1"/>
     <w:semiHidden/>
     <w:unhideWhenUsed/>
   </w:style>
-  <w:style w:type="table" w:default="1" w:styleId="a1">
+  <w:style w:type="table" w:default="1" w:styleId="TableNormal">
     <w:name w:val="Normal Table"/>
     <w:uiPriority w:val="99"/>
     <w:semiHidden/>
@@ -1315,11 +3433,43 @@
       </w:tblCellMar>
     </w:tblPr>
   </w:style>
-  <w:style w:type="numbering" w:default="1" w:styleId="a2">
+  <w:style w:type="numbering" w:default="1" w:styleId="NoList">
     <w:name w:val="No List"/>
     <w:uiPriority w:val="99"/>
     <w:semiHidden/>
     <w:unhideWhenUsed/>
+  </w:style>
+  <w:style w:type="table" w:styleId="TableGrid">
+    <w:name w:val="Table Grid"/>
+    <w:basedOn w:val="TableNormal"/>
+    <w:uiPriority w:val="39"/>
+    <w:rsid w:val="00A97057"/>
+    <w:pPr>
+      <w:spacing w:after="0" w:line="240" w:lineRule="auto"/>
+    </w:pPr>
+    <w:tblPr>
+      <w:tblBorders>
+        <w:top w:val="single" w:sz="4" w:space="0" w:color="auto"/>
+        <w:left w:val="single" w:sz="4" w:space="0" w:color="auto"/>
+        <w:bottom w:val="single" w:sz="4" w:space="0" w:color="auto"/>
+        <w:right w:val="single" w:sz="4" w:space="0" w:color="auto"/>
+        <w:insideH w:val="single" w:sz="4" w:space="0" w:color="auto"/>
+        <w:insideV w:val="single" w:sz="4" w:space="0" w:color="auto"/>
+      </w:tblBorders>
+    </w:tblPr>
+  </w:style>
+  <w:style w:type="character" w:customStyle="1" w:styleId="Heading1Char">
+    <w:name w:val="Heading 1 Char"/>
+    <w:basedOn w:val="DefaultParagraphFont"/>
+    <w:link w:val="Heading1"/>
+    <w:uiPriority w:val="9"/>
+    <w:rsid w:val="004D1052"/>
+    <w:rPr>
+      <w:rFonts w:asciiTheme="majorHAnsi" w:eastAsiaTheme="majorEastAsia" w:hAnsiTheme="majorHAnsi" w:cstheme="majorBidi"/>
+      <w:color w:val="000000" w:themeColor="text1"/>
+      <w:sz w:val="32"/>
+      <w:szCs w:val="32"/>
+    </w:rPr>
   </w:style>
 </w:styles>
 </file>

</xml_diff>